<commit_message>
R: edit nội dung C1
</commit_message>
<xml_diff>
--- a/C1.docx
+++ b/C1.docx
@@ -16,6 +16,26 @@
       </w:pPr>
       <w:r>
         <w:t>A2</w:t>
+      </w:r>
+    </w:p>
+    <w:p>
+      <w:r>
+        <w:t>1</w:t>
+      </w:r>
+    </w:p>
+    <w:p>
+      <w:r>
+        <w:t>2</w:t>
+      </w:r>
+    </w:p>
+    <w:p>
+      <w:r>
+        <w:t>34</w:t>
+      </w:r>
+    </w:p>
+    <w:p>
+      <w:r>
+        <w:t>4</w:t>
       </w:r>
     </w:p>
     <w:p>

</xml_diff>